<commit_message>
Revise Phase 9 acknowledgements for both mentors
</commit_message>
<xml_diff>
--- a/deliverables/گزارش-پژوهشی-مرحله-۹-کنترل-مرزها.docx
+++ b/deliverables/گزارش-پژوهشی-مرحله-۹-کنترل-مرزها.docx
@@ -4336,7 +4336,62 @@
           <w:rtl w:val="1"/>
           <w:lang w:val="fa-IR" w:bidi="fa-IR"/>
         </w:rPr>
-        <w:t xml:space="preserve">ایده‌ی پیوند بخش‌بندی رویداد با حافظه‌ی گفت‌وگو از آموزش‌های مغز و شناخت و </w:t>
+        <w:t xml:space="preserve">از </w:t>
+      </w:r>
+      <w:r>
+        <w:rPr>
+          <w:rFonts w:ascii="B Nazanin" w:hAnsi="B Nazanin" w:cs="B Nazanin" w:eastAsia="B Nazanin"/>
+          <w:b/>
+          <w:color w:val="000000"/>
+          <w:sz w:val="25"/>
+          <w:rtl w:val="1"/>
+          <w:lang w:val="fa-IR" w:bidi="fa-IR"/>
+        </w:rPr>
+        <w:t>دکتر آرش فکری</w:t>
+      </w:r>
+      <w:r>
+        <w:rPr>
+          <w:rFonts w:ascii="B Nazanin" w:hAnsi="B Nazanin" w:cs="B Nazanin" w:eastAsia="B Nazanin"/>
+          <w:b w:val="0"/>
+          <w:color w:val="000000"/>
+          <w:sz w:val="25"/>
+          <w:rtl w:val="1"/>
+          <w:lang w:val="fa-IR" w:bidi="fa-IR"/>
+        </w:rPr>
+        <w:t xml:space="preserve">، بنیان‌گذار </w:t>
+      </w:r>
+      <w:r>
+        <w:rPr>
+          <w:rFonts w:ascii="DejaVu Sans" w:hAnsi="DejaVu Sans" w:cs="DejaVu Sans" w:eastAsia="DejaVu Sans"/>
+          <w:b/>
+          <w:color w:val="000000"/>
+          <w:sz w:val="19"/>
+          <w:rtl w:val="0"/>
+          <w:lang w:val="en-US" w:bidi="en-US"/>
+        </w:rPr>
+        <w:t>FARDIAT</w:t>
+      </w:r>
+      <w:r>
+        <w:rPr>
+          <w:rFonts w:ascii="B Nazanin" w:hAnsi="B Nazanin" w:cs="B Nazanin" w:eastAsia="B Nazanin"/>
+          <w:b/>
+          <w:color w:val="000000"/>
+          <w:sz w:val="25"/>
+          <w:rtl w:val="1"/>
+          <w:lang w:val="fa-IR" w:bidi="fa-IR"/>
+        </w:rPr>
+        <w:t>، مجتمع فوق تخصصی مغز و شناخت</w:t>
+      </w:r>
+      <w:r>
+        <w:rPr>
+          <w:rFonts w:ascii="B Nazanin" w:hAnsi="B Nazanin" w:cs="B Nazanin" w:eastAsia="B Nazanin"/>
+          <w:b w:val="0"/>
+          <w:color w:val="000000"/>
+          <w:sz w:val="25"/>
+          <w:rtl w:val="1"/>
+          <w:lang w:val="fa-IR" w:bidi="fa-IR"/>
+        </w:rPr>
+        <w:t xml:space="preserve"> و استاد من در این حوزه، برای آموزش‌های مغز و شناخت و </w:t>
       </w:r>
       <w:r>
         <w:rPr>
@@ -4380,18 +4435,7 @@
           <w:rtl w:val="1"/>
           <w:lang w:val="fa-IR" w:bidi="fa-IR"/>
         </w:rPr>
-        <w:t xml:space="preserve"> که پژوهشگر در </w:t>
-      </w:r>
-      <w:r>
-        <w:rPr>
-          <w:rFonts w:ascii="DejaVu Sans" w:hAnsi="DejaVu Sans" w:cs="DejaVu Sans" w:eastAsia="DejaVu Sans"/>
-          <w:b/>
-          <w:color w:val="000000"/>
-          <w:sz w:val="19"/>
-          <w:rtl w:val="0"/>
-          <w:lang w:val="en-US" w:bidi="en-US"/>
-        </w:rPr>
-        <w:t>FARDIAT</w:t>
+        <w:t xml:space="preserve"> سپاسگزارم. ایده‌ی پیوند بخش‌بندی رویداد با حافظه‌ی گفت‌وگو از این آموزش‌ها شکل گرفت و ایشان پروپوزال این پروژه را نیز بررسی و تایید کردند. از </w:t>
       </w:r>
       <w:r>
         <w:rPr>
@@ -4402,7 +4446,7 @@
           <w:rtl w:val="1"/>
           <w:lang w:val="fa-IR" w:bidi="fa-IR"/>
         </w:rPr>
-        <w:t>، مجتمع فوق تخصصی مغز و شناخت</w:t>
+        <w:t>استاد نوری ولنده</w:t>
       </w:r>
       <w:r>
         <w:rPr>
@@ -4413,29 +4457,7 @@
           <w:rtl w:val="1"/>
           <w:lang w:val="fa-IR" w:bidi="fa-IR"/>
         </w:rPr>
-        <w:t xml:space="preserve"> نزد </w:t>
-      </w:r>
-      <w:r>
-        <w:rPr>
-          <w:rFonts w:ascii="B Nazanin" w:hAnsi="B Nazanin" w:cs="B Nazanin" w:eastAsia="B Nazanin"/>
-          <w:b/>
-          <w:color w:val="000000"/>
-          <w:sz w:val="25"/>
-          <w:rtl w:val="1"/>
-          <w:lang w:val="fa-IR" w:bidi="fa-IR"/>
-        </w:rPr>
-        <w:t>دکتر آرش فکری</w:t>
-      </w:r>
-      <w:r>
-        <w:rPr>
-          <w:rFonts w:ascii="B Nazanin" w:hAnsi="B Nazanin" w:cs="B Nazanin" w:eastAsia="B Nazanin"/>
-          <w:b w:val="0"/>
-          <w:color w:val="000000"/>
-          <w:sz w:val="25"/>
-          <w:rtl w:val="1"/>
-          <w:lang w:val="fa-IR" w:bidi="fa-IR"/>
-        </w:rPr>
-        <w:t xml:space="preserve"> فراگرفته الهام گرفته است. به گفته‌ی پژوهشگر، ایشان بنیان‌گذار فردیت و استاد او هستند. از این آموزش‌ها سپاسگزارم. روش، کد، داده‌کاوی و نتیجه‌های این پروژه مستقل‌اند و این ذکر به معنی تایید رسمی یا مشارکت پژوهشی فردیت نیست. نشان فردیت با فایل تصویری ارائه‌شده از سوی پژوهشگر در نسخه‌ی قابل چاپ آمده است.</w:t>
+        <w:t>، استاد دانشگاهی من در درس پروژه، برای حمایت از ایده‌های نو و همراهی در مسیر اجرای پژوهش سپاسگزارم. نشان فردیت، با فایل تصویری ارائه‌شده از سوی پژوهشگر، در نسخه‌ی قابل چاپ آمده است.</w:t>
       </w:r>
     </w:p>
     <w:p>

</xml_diff>